<commit_message>
POO S10 (Repaso C2): sintesis integradora + practica guiada (rigor). Corte 2 completo.
</commit_message>
<xml_diff>
--- a/10-week/optional-activity/pdf/Actividad-Semana10.docx
+++ b/10-week/optional-activity/pdf/Actividad-Semana10.docx
@@ -31,7 +31,7 @@
           <w:sz w:val="22"/>
           <w:szCs w:val="22"/>
         </w:rPr>
-        <w:t xml:space="preserve">Programación y Diseño Orientado a Objetos · Semana 10 · Guía de repaso del Corte 2</w:t>
+        <w:t xml:space="preserve">Programación y Diseño Orientado a Objetos · Semana 10 · Mini-sistema integrador del Corte 2</w:t>
       </w:r>
     </w:p>
     <w:tbl>
@@ -430,7 +430,7 @@
           <w:sz w:val="22"/>
           <w:szCs w:val="22"/>
         </w:rPr>
-        <w:t xml:space="preserve">Integrar herencia, interfaz y composición en un diseño.</w:t>
+        <w:t xml:space="preserve">Integrar todos los mecanismos del Corte 2 en un diseño coherente.</w:t>
       </w:r>
     </w:p>
     <w:p>
@@ -454,7 +454,7 @@
           <w:sz w:val="22"/>
           <w:szCs w:val="22"/>
         </w:rPr>
-        <w:t xml:space="preserve">Aplicar polimorfismo en un caso concreto.</w:t>
+        <w:t xml:space="preserve">Elegir cada mecanismo según la relación del problema.</w:t>
       </w:r>
     </w:p>
     <w:p>
@@ -478,7 +478,7 @@
           <w:sz w:val="22"/>
           <w:szCs w:val="22"/>
         </w:rPr>
-        <w:t xml:space="preserve">Autoevaluar la preparación para el parcial.</w:t>
+        <w:t xml:space="preserve">Verificar el comportamiento polimórfico.</w:t>
       </w:r>
     </w:p>
     <w:p>
@@ -531,7 +531,7 @@
           <w:sz w:val="22"/>
           <w:szCs w:val="22"/>
         </w:rPr>
-        <w:t xml:space="preserve">:</w:t>
+        <w:t xml:space="preserve"> (o un dominio equivalente):</w:t>
       </w:r>
     </w:p>
     <w:p>
@@ -555,7 +555,26 @@
           <w:sz w:val="22"/>
           <w:szCs w:val="22"/>
         </w:rPr>
-        <w:t xml:space="preserve">Clase abstracta </w:t>
+        <w:t xml:space="preserve">Clase </w:t>
+      </w:r>
+      <w:r>
+        <w:rPr>
+          <w:rFonts w:ascii="Times New Roman" w:hAnsi="Times New Roman" w:cs="Times New Roman"/>
+          <w:b/>
+          <w:color w:val="000000"/>
+          <w:sz w:val="22"/>
+          <w:szCs w:val="22"/>
+        </w:rPr>
+        <w:t xml:space="preserve">abstracta</w:t>
+      </w:r>
+      <w:r>
+        <w:rPr>
+          <w:rFonts w:ascii="Times New Roman" w:hAnsi="Times New Roman" w:cs="Times New Roman"/>
+          <w:color w:val="000000"/>
+          <w:sz w:val="22"/>
+          <w:szCs w:val="22"/>
+        </w:rPr>
+        <w:t xml:space="preserve"> </w:t>
       </w:r>
       <w:r>
         <w:rPr>
@@ -591,7 +610,7 @@
           <w:sz w:val="22"/>
           <w:szCs w:val="22"/>
         </w:rPr>
-        <w:t xml:space="preserve"> abstracto.</w:t>
+        <w:t xml:space="preserve"> abstracto y algún método concreto común.</w:t>
       </w:r>
     </w:p>
     <w:p>
@@ -669,7 +688,26 @@
           <w:sz w:val="22"/>
           <w:szCs w:val="22"/>
         </w:rPr>
-        <w:t xml:space="preserve">.</w:t>
+        <w:t xml:space="preserve"> (</w:t>
+      </w:r>
+      <w:r>
+        <w:rPr>
+          <w:rFonts w:ascii="Times New Roman" w:hAnsi="Times New Roman" w:cs="Times New Roman"/>
+          <w:b/>
+          <w:color w:val="000000"/>
+          <w:sz w:val="22"/>
+          <w:szCs w:val="22"/>
+        </w:rPr>
+        <w:t xml:space="preserve">herencia + sobrescritura</w:t>
+      </w:r>
+      <w:r>
+        <w:rPr>
+          <w:rFonts w:ascii="Times New Roman" w:hAnsi="Times New Roman" w:cs="Times New Roman"/>
+          <w:color w:val="000000"/>
+          <w:sz w:val="22"/>
+          <w:szCs w:val="22"/>
+        </w:rPr>
+        <w:t xml:space="preserve">).</w:t>
       </w:r>
     </w:p>
     <w:p>
@@ -729,25 +767,26 @@
           <w:sz w:val="22"/>
           <w:szCs w:val="22"/>
         </w:rPr>
-        <w:t xml:space="preserve">, </w:t>
-      </w:r>
-      <w:r>
-        <w:rPr>
-          <w:rFonts w:ascii="Consolas" w:hAnsi="Consolas" w:cs="Consolas"/>
-          <w:color w:val="000000"/>
-          <w:sz w:val="22"/>
-          <w:szCs w:val="22"/>
-        </w:rPr>
-        <w:t xml:space="preserve">detener()</w:t>
-      </w:r>
-      <w:r>
-        <w:rPr>
-          <w:rFonts w:ascii="Times New Roman" w:hAnsi="Times New Roman" w:cs="Times New Roman"/>
-          <w:color w:val="000000"/>
-          <w:sz w:val="22"/>
-          <w:szCs w:val="22"/>
-        </w:rPr>
-        <w:t xml:space="preserve">) implementada por ambas.</w:t>
+        <w:t xml:space="preserve">) implementada por ambas (</w:t>
+      </w:r>
+      <w:r>
+        <w:rPr>
+          <w:rFonts w:ascii="Times New Roman" w:hAnsi="Times New Roman" w:cs="Times New Roman"/>
+          <w:b/>
+          <w:color w:val="000000"/>
+          <w:sz w:val="22"/>
+          <w:szCs w:val="22"/>
+        </w:rPr>
+        <w:t xml:space="preserve">capacidad</w:t>
+      </w:r>
+      <w:r>
+        <w:rPr>
+          <w:rFonts w:ascii="Times New Roman" w:hAnsi="Times New Roman" w:cs="Times New Roman"/>
+          <w:color w:val="000000"/>
+          <w:sz w:val="22"/>
+          <w:szCs w:val="22"/>
+        </w:rPr>
+        <w:t xml:space="preserve">).</w:t>
       </w:r>
     </w:p>
     <w:p>
@@ -771,7 +810,7 @@
           <w:sz w:val="22"/>
           <w:szCs w:val="22"/>
         </w:rPr>
-        <w:t xml:space="preserve">Una clase </w:t>
+        <w:t xml:space="preserve">Clase </w:t>
       </w:r>
       <w:r>
         <w:rPr>
@@ -826,7 +865,81 @@
           <w:sz w:val="22"/>
           <w:szCs w:val="22"/>
         </w:rPr>
-        <w:t xml:space="preserve"> (composición) y calcule la duración total.</w:t>
+        <w:t xml:space="preserve"> (</w:t>
+      </w:r>
+      <w:r>
+        <w:rPr>
+          <w:rFonts w:ascii="Times New Roman" w:hAnsi="Times New Roman" w:cs="Times New Roman"/>
+          <w:b/>
+          <w:color w:val="000000"/>
+          <w:sz w:val="22"/>
+          <w:szCs w:val="22"/>
+        </w:rPr>
+        <w:t xml:space="preserve">composición</w:t>
+      </w:r>
+      <w:r>
+        <w:rPr>
+          <w:rFonts w:ascii="Times New Roman" w:hAnsi="Times New Roman" w:cs="Times New Roman"/>
+          <w:color w:val="000000"/>
+          <w:sz w:val="22"/>
+          <w:szCs w:val="22"/>
+        </w:rPr>
+        <w:t xml:space="preserve">) y calcule </w:t>
+      </w:r>
+      <w:r>
+        <w:rPr>
+          <w:rFonts w:ascii="Consolas" w:hAnsi="Consolas" w:cs="Consolas"/>
+          <w:color w:val="000000"/>
+          <w:sz w:val="22"/>
+          <w:szCs w:val="22"/>
+        </w:rPr>
+        <w:t xml:space="preserve">duracionTotal()</w:t>
+      </w:r>
+      <w:r>
+        <w:rPr>
+          <w:rFonts w:ascii="Times New Roman" w:hAnsi="Times New Roman" w:cs="Times New Roman"/>
+          <w:color w:val="000000"/>
+          <w:sz w:val="22"/>
+          <w:szCs w:val="22"/>
+        </w:rPr>
+        <w:t xml:space="preserve"> y </w:t>
+      </w:r>
+      <w:r>
+        <w:rPr>
+          <w:rFonts w:ascii="Consolas" w:hAnsi="Consolas" w:cs="Consolas"/>
+          <w:color w:val="000000"/>
+          <w:sz w:val="22"/>
+          <w:szCs w:val="22"/>
+        </w:rPr>
+        <w:t xml:space="preserve">reproducirTodo()</w:t>
+      </w:r>
+      <w:r>
+        <w:rPr>
+          <w:rFonts w:ascii="Times New Roman" w:hAnsi="Times New Roman" w:cs="Times New Roman"/>
+          <w:color w:val="000000"/>
+          <w:sz w:val="22"/>
+          <w:szCs w:val="22"/>
+        </w:rPr>
+        <w:t xml:space="preserve"> (</w:t>
+      </w:r>
+      <w:r>
+        <w:rPr>
+          <w:rFonts w:ascii="Times New Roman" w:hAnsi="Times New Roman" w:cs="Times New Roman"/>
+          <w:b/>
+          <w:color w:val="000000"/>
+          <w:sz w:val="22"/>
+          <w:szCs w:val="22"/>
+        </w:rPr>
+        <w:t xml:space="preserve">polimorfismo</w:t>
+      </w:r>
+      <w:r>
+        <w:rPr>
+          <w:rFonts w:ascii="Times New Roman" w:hAnsi="Times New Roman" w:cs="Times New Roman"/>
+          <w:color w:val="000000"/>
+          <w:sz w:val="22"/>
+          <w:szCs w:val="22"/>
+        </w:rPr>
+        <w:t xml:space="preserve">).</w:t>
       </w:r>
     </w:p>
     <w:p>
@@ -850,16 +963,16 @@
           <w:sz w:val="22"/>
           <w:szCs w:val="22"/>
         </w:rPr>
-        <w:t xml:space="preserve">main</w:t>
-      </w:r>
-      <w:r>
-        <w:rPr>
-          <w:rFonts w:ascii="Times New Roman" w:hAnsi="Times New Roman" w:cs="Times New Roman"/>
-          <w:color w:val="000000"/>
-          <w:sz w:val="22"/>
-          <w:szCs w:val="22"/>
-        </w:rPr>
-        <w:t xml:space="preserve"> que use polimorfismo para reproducir todos los medios.</w:t>
+        <w:t xml:space="preserve">Main</w:t>
+      </w:r>
+      <w:r>
+        <w:rPr>
+          <w:rFonts w:ascii="Times New Roman" w:hAnsi="Times New Roman" w:cs="Times New Roman"/>
+          <w:color w:val="000000"/>
+          <w:sz w:val="22"/>
+          <w:szCs w:val="22"/>
+        </w:rPr>
+        <w:t xml:space="preserve"> que arme una playlist con varios medios, la reproduzca e informe la duración total.</w:t>
       </w:r>
     </w:p>
     <w:p>
@@ -902,7 +1015,26 @@
           <w:sz w:val="22"/>
           <w:szCs w:val="22"/>
         </w:rPr>
-        <w:t xml:space="preserve">Herencia + interfaz + composición, todas presentes.</w:t>
+        <w:t xml:space="preserve">Herencia + abstracción + interfaz + polimorfismo + composición, todos presentes y </w:t>
+      </w:r>
+      <w:r>
+        <w:rPr>
+          <w:rFonts w:ascii="Times New Roman" w:hAnsi="Times New Roman" w:cs="Times New Roman"/>
+          <w:b/>
+          <w:color w:val="000000"/>
+          <w:sz w:val="22"/>
+          <w:szCs w:val="22"/>
+        </w:rPr>
+        <w:t xml:space="preserve">justificados</w:t>
+      </w:r>
+      <w:r>
+        <w:rPr>
+          <w:rFonts w:ascii="Times New Roman" w:hAnsi="Times New Roman" w:cs="Times New Roman"/>
+          <w:color w:val="000000"/>
+          <w:sz w:val="22"/>
+          <w:szCs w:val="22"/>
+        </w:rPr>
+        <w:t xml:space="preserve"> en el README (qué relación motivó cada uno).</w:t>
       </w:r>
     </w:p>
     <w:p>
@@ -926,7 +1058,7 @@
           <w:sz w:val="22"/>
           <w:szCs w:val="22"/>
         </w:rPr>
-        <w:t xml:space="preserve">Uso polimórfico (lista de </w:t>
+        <w:t xml:space="preserve">Uso polimórfico real (recorrer </w:t>
       </w:r>
       <w:r>
         <w:rPr>
@@ -935,7 +1067,7 @@
           <w:sz w:val="22"/>
           <w:szCs w:val="22"/>
         </w:rPr>
-        <w:t xml:space="preserve">Medio</w:t>
+        <w:t xml:space="preserve">List&lt;Medio&gt;</w:t>
       </w:r>
       <w:r>
         <w:rPr>
@@ -963,12 +1095,21 @@
       </w:r>
       <w:r>
         <w:rPr>
-          <w:rFonts w:ascii="Times New Roman" w:hAnsi="Times New Roman" w:cs="Times New Roman"/>
-          <w:color w:val="000000"/>
-          <w:sz w:val="22"/>
-          <w:szCs w:val="22"/>
-        </w:rPr>
-        <w:t xml:space="preserve">Cálculo correcto de la duración total.</w:t>
+          <w:rFonts w:ascii="Consolas" w:hAnsi="Consolas" w:cs="Consolas"/>
+          <w:color w:val="000000"/>
+          <w:sz w:val="22"/>
+          <w:szCs w:val="22"/>
+        </w:rPr>
+        <w:t xml:space="preserve">@Override</w:t>
+      </w:r>
+      <w:r>
+        <w:rPr>
+          <w:rFonts w:ascii="Times New Roman" w:hAnsi="Times New Roman" w:cs="Times New Roman"/>
+          <w:color w:val="000000"/>
+          <w:sz w:val="22"/>
+          <w:szCs w:val="22"/>
+        </w:rPr>
+        <w:t xml:space="preserve"> donde corresponde.</w:t>
       </w:r>
     </w:p>
     <w:p>
@@ -1030,7 +1171,7 @@
           <w:sz w:val="22"/>
           <w:szCs w:val="22"/>
         </w:rPr>
-        <w:t xml:space="preserve">poo-s10-repaso</w:t>
+        <w:t xml:space="preserve">poo-s10-integrador-c2</w:t>
       </w:r>
       <w:r>
         <w:rPr>
@@ -1055,7 +1196,7 @@
           <w:sz w:val="18"/>
           <w:szCs w:val="18"/>
         </w:rPr>
-        <w:t xml:space="preserve">poo-s10-repaso/</w:t>
+        <w:t xml:space="preserve">poo-s10-integrador-c2/</w:t>
       </w:r>
     </w:p>
     <w:p>
@@ -1071,7 +1212,7 @@
           <w:sz w:val="18"/>
           <w:szCs w:val="18"/>
         </w:rPr>
-        <w:t xml:space="preserve">  README.md   -&gt; diseno (relaciones) + salida</w:t>
+        <w:t xml:space="preserve">  README.md   -&gt; diagrama de relaciones + justificacion de cada mecanismo</w:t>
       </w:r>
     </w:p>
     <w:p>
@@ -1111,7 +1252,7 @@
           <w:sz w:val="22"/>
           <w:szCs w:val="22"/>
         </w:rPr>
-        <w:t xml:space="preserve">Crea el repo público con ese nombre.</w:t>
+        <w:t xml:space="preserve">Crea el repositorio público con ese nombre.</w:t>
       </w:r>
     </w:p>
     <w:p>
@@ -1159,7 +1300,7 @@
           <w:sz w:val="22"/>
           <w:szCs w:val="22"/>
         </w:rPr>
-        <w:t xml:space="preserve">Comparte el enlace por el canal indicado.</w:t>
+        <w:t xml:space="preserve">Comparte el enlace por el canal indicado por el docente.</w:t>
       </w:r>
     </w:p>
     <w:p>
@@ -1242,7 +1383,7 @@
                 <w:sz w:val="20"/>
                 <w:szCs w:val="20"/>
               </w:rPr>
-              <w:t xml:space="preserve">Excelente</w:t>
+              <w:t xml:space="preserve">Excelente (100%)</w:t>
             </w:r>
           </w:p>
         </w:tc>
@@ -1264,7 +1405,7 @@
                 <w:sz w:val="20"/>
                 <w:szCs w:val="20"/>
               </w:rPr>
-              <w:t xml:space="preserve">Aceptable</w:t>
+              <w:t xml:space="preserve">Aceptable (60%)</w:t>
             </w:r>
           </w:p>
         </w:tc>
@@ -1286,7 +1427,7 @@
                 <w:sz w:val="20"/>
                 <w:szCs w:val="20"/>
               </w:rPr>
-              <w:t xml:space="preserve">Por mejorar</w:t>
+              <w:t xml:space="preserve">Por mejorar (0%)</w:t>
             </w:r>
           </w:p>
         </w:tc>
@@ -1350,7 +1491,7 @@
                 <w:sz w:val="20"/>
                 <w:szCs w:val="20"/>
               </w:rPr>
-              <w:t xml:space="preserve">Correctas</w:t>
+              <w:t xml:space="preserve">Correctas y justificadas</w:t>
             </w:r>
           </w:p>
         </w:tc>
@@ -1410,7 +1551,7 @@
                 <w:sz w:val="20"/>
                 <w:szCs w:val="20"/>
               </w:rPr>
-              <w:t xml:space="preserve">30</w:t>
+              <w:t xml:space="preserve">25</w:t>
             </w:r>
           </w:p>
         </w:tc>
@@ -1432,7 +1573,7 @@
                 <w:sz w:val="20"/>
                 <w:szCs w:val="20"/>
               </w:rPr>
-              <w:t xml:space="preserve">Interfaz implementada</w:t>
+              <w:t xml:space="preserve">Interfaz (capacidad)</w:t>
             </w:r>
           </w:p>
         </w:tc>
@@ -1512,7 +1653,7 @@
                 <w:sz w:val="20"/>
                 <w:szCs w:val="20"/>
               </w:rPr>
-              <w:t xml:space="preserve">20</w:t>
+              <w:t xml:space="preserve">15</w:t>
             </w:r>
           </w:p>
         </w:tc>
@@ -1636,7 +1777,7 @@
                 <w:sz w:val="20"/>
                 <w:szCs w:val="20"/>
               </w:rPr>
-              <w:t xml:space="preserve">Polimorfismo + README</w:t>
+              <w:t xml:space="preserve">Polimorfismo (recorrido)</w:t>
             </w:r>
           </w:p>
         </w:tc>
@@ -1656,7 +1797,7 @@
                 <w:sz w:val="20"/>
                 <w:szCs w:val="20"/>
               </w:rPr>
-              <w:t xml:space="preserve">Correcto y claro</w:t>
+              <w:t xml:space="preserve">Correcto</w:t>
             </w:r>
           </w:p>
         </w:tc>
@@ -1676,7 +1817,7 @@
                 <w:sz w:val="20"/>
                 <w:szCs w:val="20"/>
               </w:rPr>
-              <w:t xml:space="preserve">Aceptable</w:t>
+              <w:t xml:space="preserve">Con detalles</w:t>
             </w:r>
           </w:p>
         </w:tc>
@@ -1696,7 +1837,7 @@
                 <w:sz w:val="20"/>
                 <w:szCs w:val="20"/>
               </w:rPr>
-              <w:t xml:space="preserve">Deficiente</w:t>
+              <w:t xml:space="preserve">Ausente</w:t>
             </w:r>
           </w:p>
         </w:tc>
@@ -1716,7 +1857,109 @@
                 <w:sz w:val="20"/>
                 <w:szCs w:val="20"/>
               </w:rPr>
-              <w:t xml:space="preserve">25</w:t>
+              <w:t xml:space="preserve">20</w:t>
+            </w:r>
+          </w:p>
+        </w:tc>
+      </w:tr>
+      <w:tr>
+        <w:tc>
+          <w:tcPr>
+            <w:tcW w:w="0" w:type="auto"/>
+            <w:vAlign w:val="center"/>
+          </w:tcPr>
+          <w:p>
+            <w:pPr>
+              <w:spacing w:after="20" w:before="20"/>
+            </w:pPr>
+            <w:r>
+              <w:rPr>
+                <w:rFonts w:ascii="Times New Roman" w:hAnsi="Times New Roman" w:cs="Times New Roman"/>
+                <w:color w:val="000000"/>
+                <w:sz w:val="20"/>
+                <w:szCs w:val="20"/>
+              </w:rPr>
+              <w:t xml:space="preserve">README (relaciones justificadas)</w:t>
+            </w:r>
+          </w:p>
+        </w:tc>
+        <w:tc>
+          <w:tcPr>
+            <w:tcW w:w="0" w:type="auto"/>
+            <w:vAlign w:val="center"/>
+          </w:tcPr>
+          <w:p>
+            <w:pPr>
+              <w:spacing w:after="20" w:before="20"/>
+            </w:pPr>
+            <w:r>
+              <w:rPr>
+                <w:rFonts w:ascii="Times New Roman" w:hAnsi="Times New Roman" w:cs="Times New Roman"/>
+                <w:color w:val="000000"/>
+                <w:sz w:val="20"/>
+                <w:szCs w:val="20"/>
+              </w:rPr>
+              <w:t xml:space="preserve">Claro y completo</w:t>
+            </w:r>
+          </w:p>
+        </w:tc>
+        <w:tc>
+          <w:tcPr>
+            <w:tcW w:w="0" w:type="auto"/>
+            <w:vAlign w:val="center"/>
+          </w:tcPr>
+          <w:p>
+            <w:pPr>
+              <w:spacing w:after="20" w:before="20"/>
+            </w:pPr>
+            <w:r>
+              <w:rPr>
+                <w:rFonts w:ascii="Times New Roman" w:hAnsi="Times New Roman" w:cs="Times New Roman"/>
+                <w:color w:val="000000"/>
+                <w:sz w:val="20"/>
+                <w:szCs w:val="20"/>
+              </w:rPr>
+              <w:t xml:space="preserve">Básico</w:t>
+            </w:r>
+          </w:p>
+        </w:tc>
+        <w:tc>
+          <w:tcPr>
+            <w:tcW w:w="0" w:type="auto"/>
+            <w:vAlign w:val="center"/>
+          </w:tcPr>
+          <w:p>
+            <w:pPr>
+              <w:spacing w:after="20" w:before="20"/>
+            </w:pPr>
+            <w:r>
+              <w:rPr>
+                <w:rFonts w:ascii="Times New Roman" w:hAnsi="Times New Roman" w:cs="Times New Roman"/>
+                <w:color w:val="000000"/>
+                <w:sz w:val="20"/>
+                <w:szCs w:val="20"/>
+              </w:rPr>
+              <w:t xml:space="preserve">Ausente</w:t>
+            </w:r>
+          </w:p>
+        </w:tc>
+        <w:tc>
+          <w:tcPr>
+            <w:tcW w:w="0" w:type="auto"/>
+            <w:vAlign w:val="center"/>
+          </w:tcPr>
+          <w:p>
+            <w:pPr>
+              <w:spacing w:after="20" w:before="20"/>
+            </w:pPr>
+            <w:r>
+              <w:rPr>
+                <w:rFonts w:ascii="Times New Roman" w:hAnsi="Times New Roman" w:cs="Times New Roman"/>
+                <w:color w:val="000000"/>
+                <w:sz w:val="20"/>
+                <w:szCs w:val="20"/>
+              </w:rPr>
+              <w:t xml:space="preserve">15</w:t>
             </w:r>
           </w:p>
         </w:tc>
@@ -1735,7 +1978,7 @@
           <w:sz w:val="21"/>
           <w:szCs w:val="21"/>
         </w:rPr>
-        <w:t xml:space="preserve">Nota: actividad formativa y opcional (sin nota en Moodle). La guía unificada de entrega estará en el Manual de Entrega de Actividades Opcionales (próximamente).</w:t>
+        <w:t xml:space="preserve">Nota: actividad formativa y opcional (sin nota en Moodle). La guía unificada para entregar todas las actividades opcionales, válida para todas las materias, estará en el Manual de Entrega de Actividades Opcionales (próximamente).</w:t>
       </w:r>
     </w:p>
     <w:sectPr>

</xml_diff>